<commit_message>
BMS analytics platform v2 updated
</commit_message>
<xml_diff>
--- a/MegaProject/BMS Data Analysis/output_data/battery_report.docx
+++ b/MegaProject/BMS Data Analysis/output_data/battery_report.docx
@@ -12,9 +12,204 @@
     </w:p>
     <w:p>
       <w:r>
-        <w:t>Generated On: 22-06-2026 10:55:00</w:t>
+        <w:t>Generated On: 24-06-2026 08:54:51</w:t>
       </w:r>
     </w:p>
+    <w:p>
+      <w:pPr>
+        <w:pStyle w:val="Heading2"/>
+      </w:pPr>
+      <w:r>
+        <w:t>Executive Summary</w:t>
+      </w:r>
+    </w:p>
+    <w:tbl>
+      <w:tblPr>
+        <w:tblStyle w:val="TableGrid"/>
+        <w:tblW w:type="auto" w:w="0"/>
+        <w:tblLook w:firstColumn="1" w:firstRow="1" w:lastColumn="0" w:lastRow="0" w:noHBand="0" w:noVBand="1" w:val="04A0"/>
+      </w:tblPr>
+      <w:tblGrid>
+        <w:gridCol w:w="4320"/>
+        <w:gridCol w:w="4320"/>
+      </w:tblGrid>
+      <w:tr>
+        <w:tc>
+          <w:tcPr>
+            <w:tcW w:type="dxa" w:w="4320"/>
+          </w:tcPr>
+          <w:p>
+            <w:r>
+              <w:t>Metric</w:t>
+            </w:r>
+          </w:p>
+        </w:tc>
+        <w:tc>
+          <w:tcPr>
+            <w:tcW w:type="dxa" w:w="4320"/>
+          </w:tcPr>
+          <w:p>
+            <w:r>
+              <w:t>Value</w:t>
+            </w:r>
+          </w:p>
+        </w:tc>
+      </w:tr>
+      <w:tr>
+        <w:tc>
+          <w:tcPr>
+            <w:tcW w:type="dxa" w:w="4320"/>
+          </w:tcPr>
+          <w:p>
+            <w:r>
+              <w:t>Latest SoC</w:t>
+            </w:r>
+          </w:p>
+        </w:tc>
+        <w:tc>
+          <w:tcPr>
+            <w:tcW w:type="dxa" w:w="4320"/>
+          </w:tcPr>
+          <w:p>
+            <w:r>
+              <w:t>85.46%</w:t>
+            </w:r>
+          </w:p>
+        </w:tc>
+      </w:tr>
+      <w:tr>
+        <w:tc>
+          <w:tcPr>
+            <w:tcW w:type="dxa" w:w="4320"/>
+          </w:tcPr>
+          <w:p>
+            <w:r>
+              <w:t>Latest SoH</w:t>
+            </w:r>
+          </w:p>
+        </w:tc>
+        <w:tc>
+          <w:tcPr>
+            <w:tcW w:type="dxa" w:w="4320"/>
+          </w:tcPr>
+          <w:p>
+            <w:r>
+              <w:t>95%</w:t>
+            </w:r>
+          </w:p>
+        </w:tc>
+      </w:tr>
+      <w:tr>
+        <w:tc>
+          <w:tcPr>
+            <w:tcW w:type="dxa" w:w="4320"/>
+          </w:tcPr>
+          <w:p>
+            <w:r>
+              <w:t>Latest Voltage</w:t>
+            </w:r>
+          </w:p>
+        </w:tc>
+        <w:tc>
+          <w:tcPr>
+            <w:tcW w:type="dxa" w:w="4320"/>
+          </w:tcPr>
+          <w:p>
+            <w:r>
+              <w:t>386.09 V</w:t>
+            </w:r>
+          </w:p>
+        </w:tc>
+      </w:tr>
+      <w:tr>
+        <w:tc>
+          <w:tcPr>
+            <w:tcW w:type="dxa" w:w="4320"/>
+          </w:tcPr>
+          <w:p>
+            <w:r>
+              <w:t>Maximum Temperature</w:t>
+            </w:r>
+          </w:p>
+        </w:tc>
+        <w:tc>
+          <w:tcPr>
+            <w:tcW w:type="dxa" w:w="4320"/>
+          </w:tcPr>
+          <w:p>
+            <w:r>
+              <w:t>38.62 °C</w:t>
+            </w:r>
+          </w:p>
+        </w:tc>
+      </w:tr>
+      <w:tr>
+        <w:tc>
+          <w:tcPr>
+            <w:tcW w:type="dxa" w:w="4320"/>
+          </w:tcPr>
+          <w:p>
+            <w:r>
+              <w:t>Battery Health</w:t>
+            </w:r>
+          </w:p>
+        </w:tc>
+        <w:tc>
+          <w:tcPr>
+            <w:tcW w:type="dxa" w:w="4320"/>
+          </w:tcPr>
+          <w:p>
+            <w:r>
+              <w:t>Excellent</w:t>
+            </w:r>
+          </w:p>
+        </w:tc>
+      </w:tr>
+      <w:tr>
+        <w:tc>
+          <w:tcPr>
+            <w:tcW w:type="dxa" w:w="4320"/>
+          </w:tcPr>
+          <w:p>
+            <w:r>
+              <w:t>Charging Duration</w:t>
+            </w:r>
+          </w:p>
+        </w:tc>
+        <w:tc>
+          <w:tcPr>
+            <w:tcW w:type="dxa" w:w="4320"/>
+          </w:tcPr>
+          <w:p>
+            <w:r>
+              <w:t>2.5 Hours</w:t>
+            </w:r>
+          </w:p>
+        </w:tc>
+      </w:tr>
+      <w:tr>
+        <w:tc>
+          <w:tcPr>
+            <w:tcW w:type="dxa" w:w="4320"/>
+          </w:tcPr>
+          <w:p>
+            <w:r>
+              <w:t>Overall Status</w:t>
+            </w:r>
+          </w:p>
+        </w:tc>
+        <w:tc>
+          <w:tcPr>
+            <w:tcW w:type="dxa" w:w="4320"/>
+          </w:tcPr>
+          <w:p>
+            <w:r>
+              <w:t>Normal Operation</w:t>
+            </w:r>
+          </w:p>
+        </w:tc>
+      </w:tr>
+    </w:tbl>
     <w:p>
       <w:pPr>
         <w:pStyle w:val="Heading2"/>
@@ -30,12 +225,12 @@
     </w:p>
     <w:p>
       <w:r>
-        <w:t>Start Time: 2026-01-01 00:00:00</w:t>
+        <w:t>Start Time: 2026-05-15 00:00:00</w:t>
       </w:r>
     </w:p>
     <w:p>
       <w:r>
-        <w:t>End Time: 2026-01-01 23:59:50</w:t>
+        <w:t>End Time: 2026-05-15 23:59:50</w:t>
       </w:r>
     </w:p>
     <w:p>
@@ -48,17 +243,17 @@
     </w:p>
     <w:p>
       <w:r>
-        <w:t>Latest SoC: 94.98%</w:t>
+        <w:t>Latest SoC: 85.46%</w:t>
       </w:r>
     </w:p>
     <w:p>
       <w:r>
-        <w:t>Minimum SoC: 64.95%</w:t>
+        <w:t>Minimum SoC: 80.09%</w:t>
       </w:r>
     </w:p>
     <w:p>
       <w:r>
-        <w:t>Maximum SoC: 95.0%</w:t>
+        <w:t>Maximum SoC: 85.49%</w:t>
       </w:r>
     </w:p>
     <w:p>
@@ -131,6 +326,218 @@
             </a:graphic>
           </wp:inline>
         </w:drawing>
+      </w:r>
+    </w:p>
+    <w:p>
+      <w:r>
+        <w:t>Figure 1: State of Charge variation over time.</w:t>
+      </w:r>
+    </w:p>
+    <w:p>
+      <w:pPr>
+        <w:pStyle w:val="Heading2"/>
+      </w:pPr>
+      <w:r>
+        <w:t>Voltage Analysis</w:t>
+      </w:r>
+    </w:p>
+    <w:p>
+      <w:r>
+        <w:drawing>
+          <wp:inline xmlns:a="http://schemas.openxmlformats.org/drawingml/2006/main" xmlns:pic="http://schemas.openxmlformats.org/drawingml/2006/picture">
+            <wp:extent cx="5486400" cy="3918857"/>
+            <wp:docPr id="2" name="Picture 2"/>
+            <wp:cNvGraphicFramePr>
+              <a:graphicFrameLocks noChangeAspect="1"/>
+            </wp:cNvGraphicFramePr>
+            <a:graphic>
+              <a:graphicData uri="http://schemas.openxmlformats.org/drawingml/2006/picture">
+                <pic:pic>
+                  <pic:nvPicPr>
+                    <pic:cNvPr id="0" name="voltage_chart.png"/>
+                    <pic:cNvPicPr/>
+                  </pic:nvPicPr>
+                  <pic:blipFill>
+                    <a:blip r:embed="rId10"/>
+                    <a:stretch>
+                      <a:fillRect/>
+                    </a:stretch>
+                  </pic:blipFill>
+                  <pic:spPr>
+                    <a:xfrm>
+                      <a:off x="0" y="0"/>
+                      <a:ext cx="5486400" cy="3918857"/>
+                    </a:xfrm>
+                    <a:prstGeom prst="rect"/>
+                  </pic:spPr>
+                </pic:pic>
+              </a:graphicData>
+            </a:graphic>
+          </wp:inline>
+        </w:drawing>
+      </w:r>
+    </w:p>
+    <w:p>
+      <w:r>
+        <w:t>Figure 2: Battery pack voltage variation over time.</w:t>
+      </w:r>
+    </w:p>
+    <w:p>
+      <w:r>
+        <w:t>Voltage ranged from 382.27 V to 397.34 V.</w:t>
+      </w:r>
+    </w:p>
+    <w:p>
+      <w:pPr>
+        <w:pStyle w:val="Heading2"/>
+      </w:pPr>
+      <w:r>
+        <w:t>Current Analysis</w:t>
+      </w:r>
+    </w:p>
+    <w:p>
+      <w:r>
+        <w:drawing>
+          <wp:inline xmlns:a="http://schemas.openxmlformats.org/drawingml/2006/main" xmlns:pic="http://schemas.openxmlformats.org/drawingml/2006/picture">
+            <wp:extent cx="5486400" cy="3918857"/>
+            <wp:docPr id="3" name="Picture 3"/>
+            <wp:cNvGraphicFramePr>
+              <a:graphicFrameLocks noChangeAspect="1"/>
+            </wp:cNvGraphicFramePr>
+            <a:graphic>
+              <a:graphicData uri="http://schemas.openxmlformats.org/drawingml/2006/picture">
+                <pic:pic>
+                  <pic:nvPicPr>
+                    <pic:cNvPr id="0" name="current_chart.png"/>
+                    <pic:cNvPicPr/>
+                  </pic:nvPicPr>
+                  <pic:blipFill>
+                    <a:blip r:embed="rId11"/>
+                    <a:stretch>
+                      <a:fillRect/>
+                    </a:stretch>
+                  </pic:blipFill>
+                  <pic:spPr>
+                    <a:xfrm>
+                      <a:off x="0" y="0"/>
+                      <a:ext cx="5486400" cy="3918857"/>
+                    </a:xfrm>
+                    <a:prstGeom prst="rect"/>
+                  </pic:spPr>
+                </pic:pic>
+              </a:graphicData>
+            </a:graphic>
+          </wp:inline>
+        </w:drawing>
+      </w:r>
+    </w:p>
+    <w:p>
+      <w:r>
+        <w:t>Figure 3: Battery pack current variation over time.</w:t>
+      </w:r>
+    </w:p>
+    <w:p>
+      <w:r>
+        <w:t>Maximum discharge current: 32.0 A</w:t>
+      </w:r>
+    </w:p>
+    <w:p>
+      <w:r>
+        <w:t>Maximum charging current: -38.0 A</w:t>
+      </w:r>
+    </w:p>
+    <w:p>
+      <w:pPr>
+        <w:pStyle w:val="Heading2"/>
+      </w:pPr>
+      <w:r>
+        <w:t>Temperature Analysis</w:t>
+      </w:r>
+    </w:p>
+    <w:p>
+      <w:r>
+        <w:drawing>
+          <wp:inline xmlns:a="http://schemas.openxmlformats.org/drawingml/2006/main" xmlns:pic="http://schemas.openxmlformats.org/drawingml/2006/picture">
+            <wp:extent cx="5486400" cy="3918857"/>
+            <wp:docPr id="4" name="Picture 4"/>
+            <wp:cNvGraphicFramePr>
+              <a:graphicFrameLocks noChangeAspect="1"/>
+            </wp:cNvGraphicFramePr>
+            <a:graphic>
+              <a:graphicData uri="http://schemas.openxmlformats.org/drawingml/2006/picture">
+                <pic:pic>
+                  <pic:nvPicPr>
+                    <pic:cNvPr id="0" name="temp_chart.png"/>
+                    <pic:cNvPicPr/>
+                  </pic:nvPicPr>
+                  <pic:blipFill>
+                    <a:blip r:embed="rId12"/>
+                    <a:stretch>
+                      <a:fillRect/>
+                    </a:stretch>
+                  </pic:blipFill>
+                  <pic:spPr>
+                    <a:xfrm>
+                      <a:off x="0" y="0"/>
+                      <a:ext cx="5486400" cy="3918857"/>
+                    </a:xfrm>
+                    <a:prstGeom prst="rect"/>
+                  </pic:spPr>
+                </pic:pic>
+              </a:graphicData>
+            </a:graphic>
+          </wp:inline>
+        </w:drawing>
+      </w:r>
+    </w:p>
+    <w:p>
+      <w:r>
+        <w:t>Figure 4: Battery pack temperature variation over time.</w:t>
+      </w:r>
+    </w:p>
+    <w:p>
+      <w:r>
+        <w:t>Maximum battery temperature recorded was 38.62 °C.</w:t>
+      </w:r>
+    </w:p>
+    <w:p>
+      <w:r>
+        <w:t>Temperature Status: Normal</w:t>
+      </w:r>
+    </w:p>
+    <w:p>
+      <w:pPr>
+        <w:pStyle w:val="Heading2"/>
+      </w:pPr>
+      <w:r>
+        <w:t>Alerts and Warnings</w:t>
+      </w:r>
+    </w:p>
+    <w:p>
+      <w:r>
+        <w:t>No critical alerts detected.</w:t>
+      </w:r>
+    </w:p>
+    <w:p>
+      <w:pPr>
+        <w:pStyle w:val="Heading2"/>
+      </w:pPr>
+      <w:r>
+        <w:t>Conclusion</w:t>
+      </w:r>
+    </w:p>
+    <w:p>
+      <w:r>
+        <w:br/>
+        <w:t xml:space="preserve">    The battery operated with a maximum temperature of 38.62°C,</w:t>
+        <w:br/>
+        <w:t xml:space="preserve">    maintained a State of Health of 95%,</w:t>
+        <w:br/>
+        <w:t xml:space="preserve">    and showed moderate charging activity.</w:t>
+        <w:br/>
+        <w:t xml:space="preserve">    Overall battery condition was assessed as Excellent.</w:t>
+        <w:br/>
+        <w:t xml:space="preserve">    </w:t>
       </w:r>
     </w:p>
     <w:sectPr>

</xml_diff>

<commit_message>
BMS Data Analystics System v2
</commit_message>
<xml_diff>
--- a/MegaProject/BMS Data Analysis/output_data/battery_report.docx
+++ b/MegaProject/BMS Data Analysis/output_data/battery_report.docx
@@ -12,7 +12,7 @@
     </w:p>
     <w:p>
       <w:r>
-        <w:t>Generated On: 24-06-2026 08:54:51</w:t>
+        <w:t>Generated On: 24-06-2026 17:03:16</w:t>
       </w:r>
     </w:p>
     <w:p>
@@ -72,7 +72,7 @@
           </w:tcPr>
           <w:p>
             <w:r>
-              <w:t>85.46%</w:t>
+              <w:t>89.85%</w:t>
             </w:r>
           </w:p>
         </w:tc>
@@ -94,7 +94,7 @@
           </w:tcPr>
           <w:p>
             <w:r>
-              <w:t>95%</w:t>
+              <w:t>94.37%</w:t>
             </w:r>
           </w:p>
         </w:tc>
@@ -116,7 +116,7 @@
           </w:tcPr>
           <w:p>
             <w:r>
-              <w:t>386.09 V</w:t>
+              <w:t>390.8 V</w:t>
             </w:r>
           </w:p>
         </w:tc>
@@ -138,7 +138,7 @@
           </w:tcPr>
           <w:p>
             <w:r>
-              <w:t>38.62 °C</w:t>
+              <w:t>41.34 °C</w:t>
             </w:r>
           </w:p>
         </w:tc>
@@ -160,7 +160,7 @@
           </w:tcPr>
           <w:p>
             <w:r>
-              <w:t>Excellent</w:t>
+              <w:t>Good</w:t>
             </w:r>
           </w:p>
         </w:tc>
@@ -182,7 +182,7 @@
           </w:tcPr>
           <w:p>
             <w:r>
-              <w:t>2.5 Hours</w:t>
+              <w:t>2.3 Hours</w:t>
             </w:r>
           </w:p>
         </w:tc>
@@ -243,27 +243,27 @@
     </w:p>
     <w:p>
       <w:r>
-        <w:t>Latest SoC: 85.46%</w:t>
+        <w:t>Latest SoC: 89.85%</w:t>
       </w:r>
     </w:p>
     <w:p>
       <w:r>
-        <w:t>Minimum SoC: 80.09%</w:t>
+        <w:t>Minimum SoC: 87.08%</w:t>
       </w:r>
     </w:p>
     <w:p>
       <w:r>
-        <w:t>Maximum SoC: 85.49%</w:t>
+        <w:t>Maximum SoC: 89.88%</w:t>
       </w:r>
     </w:p>
     <w:p>
       <w:r>
-        <w:t>Latest SoH: 95%</w:t>
+        <w:t>Latest SoH: 94.37%</w:t>
       </w:r>
     </w:p>
     <w:p>
       <w:r>
-        <w:t>Battery Health Status: Excellent</w:t>
+        <w:t>Battery Health Status: Good</w:t>
       </w:r>
     </w:p>
     <w:p>
@@ -276,7 +276,7 @@
     </w:p>
     <w:p>
       <w:r>
-        <w:t>Total Charging Duration: 2.5 hours</w:t>
+        <w:t>Total Charging Duration: 2.3 hours</w:t>
       </w:r>
     </w:p>
     <w:p>
@@ -384,7 +384,7 @@
     </w:p>
     <w:p>
       <w:r>
-        <w:t>Voltage ranged from 382.27 V to 397.34 V.</w:t>
+        <w:t>Voltage ranged from 376.52 V to 397.71 V.</w:t>
       </w:r>
     </w:p>
     <w:p>
@@ -438,12 +438,12 @@
     </w:p>
     <w:p>
       <w:r>
-        <w:t>Maximum discharge current: 32.0 A</w:t>
+        <w:t>Maximum discharge current: 18.93 A</w:t>
       </w:r>
     </w:p>
     <w:p>
       <w:r>
-        <w:t>Maximum charging current: -38.0 A</w:t>
+        <w:t>Maximum charging current: -254.19 A</w:t>
       </w:r>
     </w:p>
     <w:p>
@@ -497,7 +497,7 @@
     </w:p>
     <w:p>
       <w:r>
-        <w:t>Maximum battery temperature recorded was 38.62 °C.</w:t>
+        <w:t>Maximum battery temperature recorded was 41.34 °C.</w:t>
       </w:r>
     </w:p>
     <w:p>
@@ -529,13 +529,13 @@
     <w:p>
       <w:r>
         <w:br/>
-        <w:t xml:space="preserve">    The battery operated with a maximum temperature of 38.62°C,</w:t>
+        <w:t xml:space="preserve">    The battery operated with a maximum temperature of 41.34°C,</w:t>
         <w:br/>
-        <w:t xml:space="preserve">    maintained a State of Health of 95%,</w:t>
+        <w:t xml:space="preserve">    maintained a State of Health of 94.37%,</w:t>
         <w:br/>
         <w:t xml:space="preserve">    and showed moderate charging activity.</w:t>
         <w:br/>
-        <w:t xml:space="preserve">    Overall battery condition was assessed as Excellent.</w:t>
+        <w:t xml:space="preserve">    Overall battery condition was assessed as Normal Operation.</w:t>
         <w:br/>
         <w:t xml:space="preserve">    </w:t>
       </w:r>

</xml_diff>